<commit_message>
feat(admin): complete phase 5 admin, approval and platform management module
</commit_message>
<xml_diff>
--- a/docs/phase4/Weekly_Status_Report_Week4_Mihir_Dadwal.docx
+++ b/docs/phase4/Weekly_Status_Report_Week4_Mihir_Dadwal.docx
@@ -71,7 +71,23 @@
                 <w:rFonts w:ascii="Segoe UI" w:hAnsi="Segoe UI"/>
                 <w:sz w:val="19"/>
               </w:rPr>
-              <w:t>Project: KGSS 607 - HomeSlot Real Estate Listing &amp; Booking Platform</w:t>
+              <w:t xml:space="preserve">Project: KGSS 607 - </w:t>
+            </w:r>
+            <w:proofErr w:type="spellStart"/>
+            <w:r>
+              <w:rPr>
+                <w:rFonts w:ascii="Segoe UI" w:hAnsi="Segoe UI"/>
+                <w:sz w:val="19"/>
+              </w:rPr>
+              <w:t>HomeSlot</w:t>
+            </w:r>
+            <w:proofErr w:type="spellEnd"/>
+            <w:r>
+              <w:rPr>
+                <w:rFonts w:ascii="Segoe UI" w:hAnsi="Segoe UI"/>
+                <w:sz w:val="19"/>
+              </w:rPr>
+              <w:t xml:space="preserve"> Real Estate Listing &amp; Booking Platform</w:t>
             </w:r>
           </w:p>
         </w:tc>
@@ -171,7 +187,23 @@
                 <w:rFonts w:ascii="Segoe UI" w:hAnsi="Segoe UI"/>
                 <w:sz w:val="19"/>
               </w:rPr>
-              <w:t>Project Coordinator: Vaishali Pujari</w:t>
+              <w:t xml:space="preserve">Project Coordinator: </w:t>
+            </w:r>
+            <w:proofErr w:type="spellStart"/>
+            <w:r>
+              <w:rPr>
+                <w:rFonts w:ascii="Segoe UI" w:hAnsi="Segoe UI"/>
+                <w:sz w:val="19"/>
+              </w:rPr>
+              <w:t>Vaishali</w:t>
+            </w:r>
+            <w:proofErr w:type="spellEnd"/>
+            <w:r>
+              <w:rPr>
+                <w:rFonts w:ascii="Segoe UI" w:hAnsi="Segoe UI"/>
+                <w:sz w:val="19"/>
+              </w:rPr>
+              <w:t xml:space="preserve"> Pujari</w:t>
             </w:r>
           </w:p>
         </w:tc>
@@ -328,7 +360,25 @@
           <w:color w:val="000000"/>
           <w:sz w:val="21"/>
         </w:rPr>
-        <w:t>During Week 4 (26 Aug 2026 - 01 Sep 2026), the Builder &amp; Property Management Module (Phase 4) of the HomeSlot Real Estate Platform was fully implemented, integrated, and verified. The primary objective of this phase was to deliver a dedicated, high-performance Builder Portal enabling developer partners to post new property listings, edit active inventory details, upload media assets, track buyer leads, send replies to inquiries, manage scheduled site visits, and configure builder company profiles.</w:t>
+        <w:t xml:space="preserve">During Week 4 (26 Aug 2026 - 01 Sep 2026), the Builder &amp; Property Management Module (Phase 4) of the </w:t>
+      </w:r>
+      <w:proofErr w:type="spellStart"/>
+      <w:r>
+        <w:rPr>
+          <w:rFonts w:ascii="Segoe UI" w:hAnsi="Segoe UI"/>
+          <w:color w:val="000000"/>
+          <w:sz w:val="21"/>
+        </w:rPr>
+        <w:t>HomeSlot</w:t>
+      </w:r>
+      <w:proofErr w:type="spellEnd"/>
+      <w:r>
+        <w:rPr>
+          <w:rFonts w:ascii="Segoe UI" w:hAnsi="Segoe UI"/>
+          <w:color w:val="000000"/>
+          <w:sz w:val="21"/>
+        </w:rPr>
+        <w:t xml:space="preserve"> Real Estate Platform was fully implemented, integrated, and verified. The primary objective of this phase was to deliver a dedicated, high-performance Builder Portal enabling developer partners to post new property listings, edit active inventory details, upload media assets, track buyer leads, send replies to inquiries, manage scheduled site visits, and configure builder company profiles.</w:t>
       </w:r>
     </w:p>
     <w:p>
@@ -345,7 +395,43 @@
           <w:color w:val="000000"/>
           <w:sz w:val="21"/>
         </w:rPr>
-        <w:t>All core functional deliverables were completed on schedule with 100% test pass rate across backend Spring Boot 3.x APIs (/api/v1/builder/**) and Angular 17 standalone UI components (BuilderDashboardComponent).</w:t>
+        <w:t>All core functional deliverables were completed on schedule with 100% test pass rate across backend Spring Boot 3.x APIs (/</w:t>
+      </w:r>
+      <w:proofErr w:type="spellStart"/>
+      <w:r>
+        <w:rPr>
+          <w:rFonts w:ascii="Segoe UI" w:hAnsi="Segoe UI"/>
+          <w:color w:val="000000"/>
+          <w:sz w:val="21"/>
+        </w:rPr>
+        <w:t>api</w:t>
+      </w:r>
+      <w:proofErr w:type="spellEnd"/>
+      <w:r>
+        <w:rPr>
+          <w:rFonts w:ascii="Segoe UI" w:hAnsi="Segoe UI"/>
+          <w:color w:val="000000"/>
+          <w:sz w:val="21"/>
+        </w:rPr>
+        <w:t>/v1/builder/**) and Angular 17 standalone UI components (</w:t>
+      </w:r>
+      <w:proofErr w:type="spellStart"/>
+      <w:r>
+        <w:rPr>
+          <w:rFonts w:ascii="Segoe UI" w:hAnsi="Segoe UI"/>
+          <w:color w:val="000000"/>
+          <w:sz w:val="21"/>
+        </w:rPr>
+        <w:t>BuilderDashboardComponent</w:t>
+      </w:r>
+      <w:proofErr w:type="spellEnd"/>
+      <w:r>
+        <w:rPr>
+          <w:rFonts w:ascii="Segoe UI" w:hAnsi="Segoe UI"/>
+          <w:color w:val="000000"/>
+          <w:sz w:val="21"/>
+        </w:rPr>
+        <w:t>).</w:t>
       </w:r>
     </w:p>
     <w:p>
@@ -558,7 +644,23 @@
                 <w:rFonts w:ascii="Segoe UI" w:hAnsi="Segoe UI"/>
                 <w:sz w:val="18"/>
               </w:rPr>
-              <w:t>Built upgraded builder portal in Angular 17 and Spring Boot REST API (/api/v1/builder/dashboard/metrics) rendering real-time metrics for total properties, active listings, total inquiries, pending leads, total site visits, and upcoming scheduled visits.</w:t>
+              <w:t>Built upgraded builder portal in Angular 17 and Spring Boot REST API (/</w:t>
+            </w:r>
+            <w:proofErr w:type="spellStart"/>
+            <w:r>
+              <w:rPr>
+                <w:rFonts w:ascii="Segoe UI" w:hAnsi="Segoe UI"/>
+                <w:sz w:val="18"/>
+              </w:rPr>
+              <w:t>api</w:t>
+            </w:r>
+            <w:proofErr w:type="spellEnd"/>
+            <w:r>
+              <w:rPr>
+                <w:rFonts w:ascii="Segoe UI" w:hAnsi="Segoe UI"/>
+                <w:sz w:val="18"/>
+              </w:rPr>
+              <w:t>/v1/builder/dashboard/metrics) rendering real-time metrics for total properties, active listings, total inquiries, pending leads, total site visits, and upcoming scheduled visits.</w:t>
             </w:r>
           </w:p>
         </w:tc>
@@ -640,7 +742,55 @@
                 <w:rFonts w:ascii="Segoe UI" w:hAnsi="Segoe UI"/>
                 <w:sz w:val="18"/>
               </w:rPr>
-              <w:t>Developed CreatePropertyRequest and UpdatePropertyRequest DTOs, BuilderService creation/update logic, property modal UI form, and validation rules for title, price, BHK, area, location, construction status, and pricing.</w:t>
+              <w:t xml:space="preserve">Developed </w:t>
+            </w:r>
+            <w:proofErr w:type="spellStart"/>
+            <w:r>
+              <w:rPr>
+                <w:rFonts w:ascii="Segoe UI" w:hAnsi="Segoe UI"/>
+                <w:sz w:val="18"/>
+              </w:rPr>
+              <w:t>CreatePropertyRequest</w:t>
+            </w:r>
+            <w:proofErr w:type="spellEnd"/>
+            <w:r>
+              <w:rPr>
+                <w:rFonts w:ascii="Segoe UI" w:hAnsi="Segoe UI"/>
+                <w:sz w:val="18"/>
+              </w:rPr>
+              <w:t xml:space="preserve"> and </w:t>
+            </w:r>
+            <w:proofErr w:type="spellStart"/>
+            <w:r>
+              <w:rPr>
+                <w:rFonts w:ascii="Segoe UI" w:hAnsi="Segoe UI"/>
+                <w:sz w:val="18"/>
+              </w:rPr>
+              <w:t>UpdatePropertyRequest</w:t>
+            </w:r>
+            <w:proofErr w:type="spellEnd"/>
+            <w:r>
+              <w:rPr>
+                <w:rFonts w:ascii="Segoe UI" w:hAnsi="Segoe UI"/>
+                <w:sz w:val="18"/>
+              </w:rPr>
+              <w:t xml:space="preserve"> DTOs, </w:t>
+            </w:r>
+            <w:proofErr w:type="spellStart"/>
+            <w:r>
+              <w:rPr>
+                <w:rFonts w:ascii="Segoe UI" w:hAnsi="Segoe UI"/>
+                <w:sz w:val="18"/>
+              </w:rPr>
+              <w:t>BuilderService</w:t>
+            </w:r>
+            <w:proofErr w:type="spellEnd"/>
+            <w:r>
+              <w:rPr>
+                <w:rFonts w:ascii="Segoe UI" w:hAnsi="Segoe UI"/>
+                <w:sz w:val="18"/>
+              </w:rPr>
+              <w:t xml:space="preserve"> creation/update logic, property modal UI form, and validation rules for title, price, BHK, area, location, construction status, and pricing.</w:t>
             </w:r>
           </w:p>
         </w:tc>
@@ -722,7 +872,31 @@
                 <w:rFonts w:ascii="Segoe UI" w:hAnsi="Segoe UI"/>
                 <w:sz w:val="18"/>
               </w:rPr>
-              <w:t>Implemented builder inventory management grid in Angular 17 UI with deletion confirmation modals, status badge rendering, and ownership validation in backend (Property.builderId == user.id).</w:t>
+              <w:t xml:space="preserve">Implemented builder inventory management </w:t>
+            </w:r>
+            <w:r>
+              <w:rPr>
+                <w:rFonts w:ascii="Segoe UI" w:hAnsi="Segoe UI"/>
+                <w:sz w:val="18"/>
+              </w:rPr>
+              <w:lastRenderedPageBreak/>
+              <w:t>grid in Angular 17 UI with deletion confirmation modals, status badge rendering, and ownership validation in backend (</w:t>
+            </w:r>
+            <w:proofErr w:type="spellStart"/>
+            <w:r>
+              <w:rPr>
+                <w:rFonts w:ascii="Segoe UI" w:hAnsi="Segoe UI"/>
+                <w:sz w:val="18"/>
+              </w:rPr>
+              <w:t>Property.builderId</w:t>
+            </w:r>
+            <w:proofErr w:type="spellEnd"/>
+            <w:r>
+              <w:rPr>
+                <w:rFonts w:ascii="Segoe UI" w:hAnsi="Segoe UI"/>
+                <w:sz w:val="18"/>
+              </w:rPr>
+              <w:t xml:space="preserve"> == user.id).</w:t>
             </w:r>
           </w:p>
         </w:tc>
@@ -744,6 +918,7 @@
                 <w:rFonts w:ascii="Segoe UI" w:hAnsi="Segoe UI"/>
                 <w:sz w:val="18"/>
               </w:rPr>
+              <w:lastRenderedPageBreak/>
               <w:t>Media Asset &amp; Document Link Management</w:t>
             </w:r>
           </w:p>
@@ -886,7 +1061,23 @@
                 <w:rFonts w:ascii="Segoe UI" w:hAnsi="Segoe UI"/>
                 <w:sz w:val="18"/>
               </w:rPr>
-              <w:t>Built builder lead management endpoints (/api/v1/builder/inquiries) displaying buyer contact information, target property titles, lead messages, submission timestamps, and filter tabs (All, Pending, Replied).</w:t>
+              <w:t>Built builder lead management endpoints (/</w:t>
+            </w:r>
+            <w:proofErr w:type="spellStart"/>
+            <w:r>
+              <w:rPr>
+                <w:rFonts w:ascii="Segoe UI" w:hAnsi="Segoe UI"/>
+                <w:sz w:val="18"/>
+              </w:rPr>
+              <w:t>api</w:t>
+            </w:r>
+            <w:proofErr w:type="spellEnd"/>
+            <w:r>
+              <w:rPr>
+                <w:rFonts w:ascii="Segoe UI" w:hAnsi="Segoe UI"/>
+                <w:sz w:val="18"/>
+              </w:rPr>
+              <w:t>/v1/builder/inquiries) displaying buyer contact information, target property titles, lead messages, submission timestamps, and filter tabs (All, Pending, Replied).</w:t>
             </w:r>
           </w:p>
         </w:tc>
@@ -968,7 +1159,71 @@
                 <w:rFonts w:ascii="Segoe UI" w:hAnsi="Segoe UI"/>
                 <w:sz w:val="18"/>
               </w:rPr>
-              <w:t>Extended PropertyInquiry entity with replyMessage and repliedAt fields, developed reply endpoint (/api/v1/builder/inquiries/{id}/reply), modal form for builders to respond to buyers, and automatic status transition to REPLIED.</w:t>
+              <w:t xml:space="preserve">Extended </w:t>
+            </w:r>
+            <w:proofErr w:type="spellStart"/>
+            <w:r>
+              <w:rPr>
+                <w:rFonts w:ascii="Segoe UI" w:hAnsi="Segoe UI"/>
+                <w:sz w:val="18"/>
+              </w:rPr>
+              <w:t>PropertyInquiry</w:t>
+            </w:r>
+            <w:proofErr w:type="spellEnd"/>
+            <w:r>
+              <w:rPr>
+                <w:rFonts w:ascii="Segoe UI" w:hAnsi="Segoe UI"/>
+                <w:sz w:val="18"/>
+              </w:rPr>
+              <w:t xml:space="preserve"> entity with </w:t>
+            </w:r>
+            <w:proofErr w:type="spellStart"/>
+            <w:r>
+              <w:rPr>
+                <w:rFonts w:ascii="Segoe UI" w:hAnsi="Segoe UI"/>
+                <w:sz w:val="18"/>
+              </w:rPr>
+              <w:t>replyMessage</w:t>
+            </w:r>
+            <w:proofErr w:type="spellEnd"/>
+            <w:r>
+              <w:rPr>
+                <w:rFonts w:ascii="Segoe UI" w:hAnsi="Segoe UI"/>
+                <w:sz w:val="18"/>
+              </w:rPr>
+              <w:t xml:space="preserve"> and </w:t>
+            </w:r>
+            <w:proofErr w:type="spellStart"/>
+            <w:r>
+              <w:rPr>
+                <w:rFonts w:ascii="Segoe UI" w:hAnsi="Segoe UI"/>
+                <w:sz w:val="18"/>
+              </w:rPr>
+              <w:t>repliedAt</w:t>
+            </w:r>
+            <w:proofErr w:type="spellEnd"/>
+            <w:r>
+              <w:rPr>
+                <w:rFonts w:ascii="Segoe UI" w:hAnsi="Segoe UI"/>
+                <w:sz w:val="18"/>
+              </w:rPr>
+              <w:t xml:space="preserve"> fields, developed reply endpoint (/</w:t>
+            </w:r>
+            <w:proofErr w:type="spellStart"/>
+            <w:r>
+              <w:rPr>
+                <w:rFonts w:ascii="Segoe UI" w:hAnsi="Segoe UI"/>
+                <w:sz w:val="18"/>
+              </w:rPr>
+              <w:t>api</w:t>
+            </w:r>
+            <w:proofErr w:type="spellEnd"/>
+            <w:r>
+              <w:rPr>
+                <w:rFonts w:ascii="Segoe UI" w:hAnsi="Segoe UI"/>
+                <w:sz w:val="18"/>
+              </w:rPr>
+              <w:t>/v1/builder/inquiries/{id}/reply), modal form for builders to respond to buyers, and automatic status transition to REPLIED.</w:t>
             </w:r>
           </w:p>
         </w:tc>
@@ -1050,7 +1305,23 @@
                 <w:rFonts w:ascii="Segoe UI" w:hAnsi="Segoe UI"/>
                 <w:sz w:val="18"/>
               </w:rPr>
-              <w:t>Developed site visit management endpoints (/api/v1/builder/site-visits), visit schedule agenda list, status badge indicator (SCHEDULED, COMPLETED, CANCELLED), and quick action buttons to update visit status.</w:t>
+              <w:t>Developed site visit management endpoints (/</w:t>
+            </w:r>
+            <w:proofErr w:type="spellStart"/>
+            <w:r>
+              <w:rPr>
+                <w:rFonts w:ascii="Segoe UI" w:hAnsi="Segoe UI"/>
+                <w:sz w:val="18"/>
+              </w:rPr>
+              <w:t>api</w:t>
+            </w:r>
+            <w:proofErr w:type="spellEnd"/>
+            <w:r>
+              <w:rPr>
+                <w:rFonts w:ascii="Segoe UI" w:hAnsi="Segoe UI"/>
+                <w:sz w:val="18"/>
+              </w:rPr>
+              <w:t>/v1/builder/site-visits), visit schedule agenda list, status badge indicator (SCHEDULED, COMPLETED, CANCELLED), and quick action buttons to update visit status.</w:t>
             </w:r>
           </w:p>
         </w:tc>
@@ -1132,7 +1403,39 @@
                 <w:rFonts w:ascii="Segoe UI" w:hAnsi="Segoe UI"/>
                 <w:sz w:val="18"/>
               </w:rPr>
-              <w:t>Created BuilderProfileDto, builder profile endpoints (/api/v1/builder/profile), and profile settings form allowing builders to update company name, contact person name, and business license number.</w:t>
+              <w:t xml:space="preserve">Created </w:t>
+            </w:r>
+            <w:proofErr w:type="spellStart"/>
+            <w:r>
+              <w:rPr>
+                <w:rFonts w:ascii="Segoe UI" w:hAnsi="Segoe UI"/>
+                <w:sz w:val="18"/>
+              </w:rPr>
+              <w:t>BuilderProfileDto</w:t>
+            </w:r>
+            <w:proofErr w:type="spellEnd"/>
+            <w:r>
+              <w:rPr>
+                <w:rFonts w:ascii="Segoe UI" w:hAnsi="Segoe UI"/>
+                <w:sz w:val="18"/>
+              </w:rPr>
+              <w:t>, builder profile endpoints (/</w:t>
+            </w:r>
+            <w:proofErr w:type="spellStart"/>
+            <w:r>
+              <w:rPr>
+                <w:rFonts w:ascii="Segoe UI" w:hAnsi="Segoe UI"/>
+                <w:sz w:val="18"/>
+              </w:rPr>
+              <w:t>api</w:t>
+            </w:r>
+            <w:proofErr w:type="spellEnd"/>
+            <w:r>
+              <w:rPr>
+                <w:rFonts w:ascii="Segoe UI" w:hAnsi="Segoe UI"/>
+                <w:sz w:val="18"/>
+              </w:rPr>
+              <w:t>/v1/builder/profile), and profile settings form allowing builders to update company name, contact person name, and business license number.</w:t>
             </w:r>
           </w:p>
         </w:tc>
@@ -1154,6 +1457,7 @@
                 <w:rFonts w:ascii="Segoe UI" w:hAnsi="Segoe UI"/>
                 <w:sz w:val="18"/>
               </w:rPr>
+              <w:lastRenderedPageBreak/>
               <w:t>Server-Side Security &amp; RBAC Enforcement</w:t>
             </w:r>
           </w:p>
@@ -1214,7 +1518,23 @@
                 <w:rFonts w:ascii="Segoe UI" w:hAnsi="Segoe UI"/>
                 <w:sz w:val="18"/>
               </w:rPr>
-              <w:t>Updated SecurityConfig.java to restrict /api/v1/builder/** to authorized users with ROLE_BUILDER or ROLE_ADMIN authorities and added property ownership validation on all builder mutation endpoints.</w:t>
+              <w:t>Updated SecurityConfig.java to restrict /</w:t>
+            </w:r>
+            <w:proofErr w:type="spellStart"/>
+            <w:r>
+              <w:rPr>
+                <w:rFonts w:ascii="Segoe UI" w:hAnsi="Segoe UI"/>
+                <w:sz w:val="18"/>
+              </w:rPr>
+              <w:t>api</w:t>
+            </w:r>
+            <w:proofErr w:type="spellEnd"/>
+            <w:r>
+              <w:rPr>
+                <w:rFonts w:ascii="Segoe UI" w:hAnsi="Segoe UI"/>
+                <w:sz w:val="18"/>
+              </w:rPr>
+              <w:t>/v1/builder/** to authorized users with ROLE_BUILDER or ROLE_ADMIN authorities and added property ownership validation on all builder mutation endpoints.</w:t>
             </w:r>
           </w:p>
         </w:tc>
@@ -1296,7 +1616,23 @@
                 <w:rFonts w:ascii="Segoe UI" w:hAnsi="Segoe UI"/>
                 <w:sz w:val="18"/>
               </w:rPr>
-              <w:t>Conducted end-to-end browser subagent verification executing registration, property creation, inquiry reply, site visit status update, and profile saving with visual WebP recording and screenshot capture.</w:t>
+              <w:t xml:space="preserve">Conducted end-to-end browser subagent verification executing registration, property creation, inquiry reply, site visit status update, and profile saving with visual </w:t>
+            </w:r>
+            <w:proofErr w:type="spellStart"/>
+            <w:r>
+              <w:rPr>
+                <w:rFonts w:ascii="Segoe UI" w:hAnsi="Segoe UI"/>
+                <w:sz w:val="18"/>
+              </w:rPr>
+              <w:t>WebP</w:t>
+            </w:r>
+            <w:proofErr w:type="spellEnd"/>
+            <w:r>
+              <w:rPr>
+                <w:rFonts w:ascii="Segoe UI" w:hAnsi="Segoe UI"/>
+                <w:sz w:val="18"/>
+              </w:rPr>
+              <w:t xml:space="preserve"> recording and screenshot capture.</w:t>
             </w:r>
           </w:p>
         </w:tc>
@@ -1335,7 +1671,89 @@
           <w:color w:val="000000"/>
           <w:sz w:val="21"/>
         </w:rPr>
-        <w:t>1. Server-Side RBAC &amp; Property Ownership Enforcement: Protected all builder endpoints under /api/v1/builder/** with Spring Security @PreAuthorize('hasAnyAuthority(''ROLE_BUILDER'', ''ROLE_ADMIN'')'). Every property update and deletion request verifies that the authenticated user's ID matches the property's builderId, preventing unauthorized cross-tenant modifications.</w:t>
+        <w:t>1. Server-Side RBAC &amp; Property Ownership Enforcement: Protected all builder endpoints under /</w:t>
+      </w:r>
+      <w:proofErr w:type="spellStart"/>
+      <w:r>
+        <w:rPr>
+          <w:rFonts w:ascii="Segoe UI" w:hAnsi="Segoe UI"/>
+          <w:color w:val="000000"/>
+          <w:sz w:val="21"/>
+        </w:rPr>
+        <w:t>api</w:t>
+      </w:r>
+      <w:proofErr w:type="spellEnd"/>
+      <w:r>
+        <w:rPr>
+          <w:rFonts w:ascii="Segoe UI" w:hAnsi="Segoe UI"/>
+          <w:color w:val="000000"/>
+          <w:sz w:val="21"/>
+        </w:rPr>
+        <w:t>/v1/builder/** with Spring Security @</w:t>
+      </w:r>
+      <w:proofErr w:type="spellStart"/>
+      <w:proofErr w:type="gramStart"/>
+      <w:r>
+        <w:rPr>
+          <w:rFonts w:ascii="Segoe UI" w:hAnsi="Segoe UI"/>
+          <w:color w:val="000000"/>
+          <w:sz w:val="21"/>
+        </w:rPr>
+        <w:t>PreAuthorize</w:t>
+      </w:r>
+      <w:proofErr w:type="spellEnd"/>
+      <w:r>
+        <w:rPr>
+          <w:rFonts w:ascii="Segoe UI" w:hAnsi="Segoe UI"/>
+          <w:color w:val="000000"/>
+          <w:sz w:val="21"/>
+        </w:rPr>
+        <w:t>(</w:t>
+      </w:r>
+      <w:proofErr w:type="gramEnd"/>
+      <w:r>
+        <w:rPr>
+          <w:rFonts w:ascii="Segoe UI" w:hAnsi="Segoe UI"/>
+          <w:color w:val="000000"/>
+          <w:sz w:val="21"/>
+        </w:rPr>
+        <w:t>'</w:t>
+      </w:r>
+      <w:proofErr w:type="spellStart"/>
+      <w:r>
+        <w:rPr>
+          <w:rFonts w:ascii="Segoe UI" w:hAnsi="Segoe UI"/>
+          <w:color w:val="000000"/>
+          <w:sz w:val="21"/>
+        </w:rPr>
+        <w:t>hasAnyAuthority</w:t>
+      </w:r>
+      <w:proofErr w:type="spellEnd"/>
+      <w:r>
+        <w:rPr>
+          <w:rFonts w:ascii="Segoe UI" w:hAnsi="Segoe UI"/>
+          <w:color w:val="000000"/>
+          <w:sz w:val="21"/>
+        </w:rPr>
+        <w:t xml:space="preserve">(''ROLE_BUILDER'', ''ROLE_ADMIN'')'). Every property update and deletion request verifies that the authenticated user's ID matches the property's </w:t>
+      </w:r>
+      <w:proofErr w:type="spellStart"/>
+      <w:r>
+        <w:rPr>
+          <w:rFonts w:ascii="Segoe UI" w:hAnsi="Segoe UI"/>
+          <w:color w:val="000000"/>
+          <w:sz w:val="21"/>
+        </w:rPr>
+        <w:t>builderId</w:t>
+      </w:r>
+      <w:proofErr w:type="spellEnd"/>
+      <w:r>
+        <w:rPr>
+          <w:rFonts w:ascii="Segoe UI" w:hAnsi="Segoe UI"/>
+          <w:color w:val="000000"/>
+          <w:sz w:val="21"/>
+        </w:rPr>
+        <w:t>, preventing unauthorized cross-tenant modifications.</w:t>
       </w:r>
     </w:p>
     <w:p>
@@ -1369,7 +1787,25 @@
           <w:color w:val="000000"/>
           <w:sz w:val="21"/>
         </w:rPr>
-        <w:t>3. Inquiry Reply Loop &amp; Customer Communication: Extended PropertyInquiry schema to persist builder reply messages and timestamps, creating a bidirectional lead resolution workflow between buyers and developers.</w:t>
+        <w:t xml:space="preserve">3. Inquiry Reply Loop &amp; Customer Communication: Extended </w:t>
+      </w:r>
+      <w:proofErr w:type="spellStart"/>
+      <w:r>
+        <w:rPr>
+          <w:rFonts w:ascii="Segoe UI" w:hAnsi="Segoe UI"/>
+          <w:color w:val="000000"/>
+          <w:sz w:val="21"/>
+        </w:rPr>
+        <w:t>PropertyInquiry</w:t>
+      </w:r>
+      <w:proofErr w:type="spellEnd"/>
+      <w:r>
+        <w:rPr>
+          <w:rFonts w:ascii="Segoe UI" w:hAnsi="Segoe UI"/>
+          <w:color w:val="000000"/>
+          <w:sz w:val="21"/>
+        </w:rPr>
+        <w:t xml:space="preserve"> schema to persist builder reply messages and timestamps, creating a bidirectional lead resolution workflow between buyers and developers.</w:t>
       </w:r>
     </w:p>
     <w:p>
@@ -1386,7 +1822,25 @@
           <w:color w:val="000000"/>
           <w:sz w:val="21"/>
         </w:rPr>
-        <w:t>4. Rich Multi-Tab Angular Builder Portal: Developed BuilderDashboardComponent in Angular 17 with tabbed navigation (Overview, My Properties, Leads &amp; Inquiries, Site Visits, Company Profile), responsive metrics grids, modal forms, status badges, and alert banners.</w:t>
+        <w:t xml:space="preserve">4. Rich Multi-Tab Angular Builder Portal: Developed </w:t>
+      </w:r>
+      <w:proofErr w:type="spellStart"/>
+      <w:r>
+        <w:rPr>
+          <w:rFonts w:ascii="Segoe UI" w:hAnsi="Segoe UI"/>
+          <w:color w:val="000000"/>
+          <w:sz w:val="21"/>
+        </w:rPr>
+        <w:t>BuilderDashboardComponent</w:t>
+      </w:r>
+      <w:proofErr w:type="spellEnd"/>
+      <w:r>
+        <w:rPr>
+          <w:rFonts w:ascii="Segoe UI" w:hAnsi="Segoe UI"/>
+          <w:color w:val="000000"/>
+          <w:sz w:val="21"/>
+        </w:rPr>
+        <w:t xml:space="preserve"> in Angular 17 with tabbed navigation (Overview, My Properties, Leads &amp; Inquiries, Site Visits, Company Profile), responsive metrics grids, modal forms, status badges, and alert banners.</w:t>
       </w:r>
     </w:p>
     <w:p>
@@ -1438,7 +1892,25 @@
           <w:color w:val="000000"/>
           <w:sz w:val="21"/>
         </w:rPr>
-        <w:t>â€¢ Backend Compilation: Executed 'mvn clean compile' â€</w:t>
+        <w:t>â€¢ Backend Compilation: Executed '</w:t>
+      </w:r>
+      <w:proofErr w:type="spellStart"/>
+      <w:r>
+        <w:rPr>
+          <w:rFonts w:ascii="Segoe UI" w:hAnsi="Segoe UI"/>
+          <w:color w:val="000000"/>
+          <w:sz w:val="21"/>
+        </w:rPr>
+        <w:t>mvn</w:t>
+      </w:r>
+      <w:proofErr w:type="spellEnd"/>
+      <w:r>
+        <w:rPr>
+          <w:rFonts w:ascii="Segoe UI" w:hAnsi="Segoe UI"/>
+          <w:color w:val="000000"/>
+          <w:sz w:val="21"/>
+        </w:rPr>
+        <w:t xml:space="preserve"> clean compile' â€</w:t>
       </w:r>
     </w:p>
     <w:p>
@@ -1455,7 +1927,43 @@
           <w:color w:val="000000"/>
           <w:sz w:val="21"/>
         </w:rPr>
-        <w:t>â€¢ Visual Proof &amp; Screenshots: Saved screenshot at docs/phase4/screenshots/builder_dashboard_overview.png and recorded WebP demonstration artifact.</w:t>
+        <w:t xml:space="preserve">â€¢ Visual Proof &amp; Screenshots: Saved screenshot at docs/phase4/screenshots/builder_dashboard_overview.png and recorded </w:t>
+      </w:r>
+      <w:proofErr w:type="spellStart"/>
+      <w:r>
+        <w:rPr>
+          <w:rFonts w:ascii="Segoe UI" w:hAnsi="Segoe UI"/>
+          <w:color w:val="000000"/>
+          <w:sz w:val="21"/>
+        </w:rPr>
+        <w:t>WebP</w:t>
+      </w:r>
+      <w:proofErr w:type="spellEnd"/>
+      <w:r>
+        <w:rPr>
+          <w:rFonts w:ascii="Segoe UI" w:hAnsi="Segoe UI"/>
+          <w:color w:val="000000"/>
+          <w:sz w:val="21"/>
+        </w:rPr>
+        <w:t xml:space="preserve"> demonstration </w:t>
+      </w:r>
+      <w:proofErr w:type="spellStart"/>
+      <w:r>
+        <w:rPr>
+          <w:rFonts w:ascii="Segoe UI" w:hAnsi="Segoe UI"/>
+          <w:color w:val="000000"/>
+          <w:sz w:val="21"/>
+        </w:rPr>
+        <w:t>artifact</w:t>
+      </w:r>
+      <w:proofErr w:type="spellEnd"/>
+      <w:r>
+        <w:rPr>
+          <w:rFonts w:ascii="Segoe UI" w:hAnsi="Segoe UI"/>
+          <w:color w:val="000000"/>
+          <w:sz w:val="21"/>
+        </w:rPr>
+        <w:t>.</w:t>
       </w:r>
     </w:p>
     <w:p>
@@ -1472,7 +1980,115 @@
           <w:color w:val="000000"/>
           <w:sz w:val="21"/>
         </w:rPr>
-        <w:t>â€¢ Deliverable Artifacts: Code committed to repository monorepo under backend/src/main/java/com/kgs/homeslot/module/property/ and frontend/src/app/features/dashboard/builder-dashboard/.</w:t>
+        <w:t xml:space="preserve">â€¢ Deliverable </w:t>
+      </w:r>
+      <w:proofErr w:type="spellStart"/>
+      <w:r>
+        <w:rPr>
+          <w:rFonts w:ascii="Segoe UI" w:hAnsi="Segoe UI"/>
+          <w:color w:val="000000"/>
+          <w:sz w:val="21"/>
+        </w:rPr>
+        <w:t>Artifacts</w:t>
+      </w:r>
+      <w:proofErr w:type="spellEnd"/>
+      <w:r>
+        <w:rPr>
+          <w:rFonts w:ascii="Segoe UI" w:hAnsi="Segoe UI"/>
+          <w:color w:val="000000"/>
+          <w:sz w:val="21"/>
+        </w:rPr>
+        <w:t xml:space="preserve">: Code committed to repository </w:t>
+      </w:r>
+      <w:proofErr w:type="spellStart"/>
+      <w:r>
+        <w:rPr>
+          <w:rFonts w:ascii="Segoe UI" w:hAnsi="Segoe UI"/>
+          <w:color w:val="000000"/>
+          <w:sz w:val="21"/>
+        </w:rPr>
+        <w:t>monorepo</w:t>
+      </w:r>
+      <w:proofErr w:type="spellEnd"/>
+      <w:r>
+        <w:rPr>
+          <w:rFonts w:ascii="Segoe UI" w:hAnsi="Segoe UI"/>
+          <w:color w:val="000000"/>
+          <w:sz w:val="21"/>
+        </w:rPr>
+        <w:t xml:space="preserve"> under backend/</w:t>
+      </w:r>
+      <w:proofErr w:type="spellStart"/>
+      <w:r>
+        <w:rPr>
+          <w:rFonts w:ascii="Segoe UI" w:hAnsi="Segoe UI"/>
+          <w:color w:val="000000"/>
+          <w:sz w:val="21"/>
+        </w:rPr>
+        <w:t>src</w:t>
+      </w:r>
+      <w:proofErr w:type="spellEnd"/>
+      <w:r>
+        <w:rPr>
+          <w:rFonts w:ascii="Segoe UI" w:hAnsi="Segoe UI"/>
+          <w:color w:val="000000"/>
+          <w:sz w:val="21"/>
+        </w:rPr>
+        <w:t>/main/java/com/</w:t>
+      </w:r>
+      <w:proofErr w:type="spellStart"/>
+      <w:r>
+        <w:rPr>
+          <w:rFonts w:ascii="Segoe UI" w:hAnsi="Segoe UI"/>
+          <w:color w:val="000000"/>
+          <w:sz w:val="21"/>
+        </w:rPr>
+        <w:t>kgs</w:t>
+      </w:r>
+      <w:proofErr w:type="spellEnd"/>
+      <w:r>
+        <w:rPr>
+          <w:rFonts w:ascii="Segoe UI" w:hAnsi="Segoe UI"/>
+          <w:color w:val="000000"/>
+          <w:sz w:val="21"/>
+        </w:rPr>
+        <w:t>/</w:t>
+      </w:r>
+      <w:proofErr w:type="spellStart"/>
+      <w:r>
+        <w:rPr>
+          <w:rFonts w:ascii="Segoe UI" w:hAnsi="Segoe UI"/>
+          <w:color w:val="000000"/>
+          <w:sz w:val="21"/>
+        </w:rPr>
+        <w:t>homeslot</w:t>
+      </w:r>
+      <w:proofErr w:type="spellEnd"/>
+      <w:r>
+        <w:rPr>
+          <w:rFonts w:ascii="Segoe UI" w:hAnsi="Segoe UI"/>
+          <w:color w:val="000000"/>
+          <w:sz w:val="21"/>
+        </w:rPr>
+        <w:t>/module/property/ and frontend/</w:t>
+      </w:r>
+      <w:proofErr w:type="spellStart"/>
+      <w:r>
+        <w:rPr>
+          <w:rFonts w:ascii="Segoe UI" w:hAnsi="Segoe UI"/>
+          <w:color w:val="000000"/>
+          <w:sz w:val="21"/>
+        </w:rPr>
+        <w:t>src</w:t>
+      </w:r>
+      <w:proofErr w:type="spellEnd"/>
+      <w:r>
+        <w:rPr>
+          <w:rFonts w:ascii="Segoe UI" w:hAnsi="Segoe UI"/>
+          <w:color w:val="000000"/>
+          <w:sz w:val="21"/>
+        </w:rPr>
+        <w:t>/app/features/dashboard/builder-dashboard/.</w:t>
       </w:r>
     </w:p>
     <w:p>
@@ -1490,6 +2106,7 @@
           <w:b/>
           <w:color w:val="333333"/>
         </w:rPr>
+        <w:lastRenderedPageBreak/>
         <w:t>5. Phase Status Summary</w:t>
       </w:r>
     </w:p>
@@ -1928,7 +2545,25 @@
           <w:color w:val="000000"/>
           <w:sz w:val="21"/>
         </w:rPr>
-        <w:t>Approved by: Vaishali Pujari (Project Coordinator)</w:t>
+        <w:t xml:space="preserve">Approved by: </w:t>
+      </w:r>
+      <w:proofErr w:type="spellStart"/>
+      <w:r>
+        <w:rPr>
+          <w:rFonts w:ascii="Segoe UI" w:hAnsi="Segoe UI"/>
+          <w:color w:val="000000"/>
+          <w:sz w:val="21"/>
+        </w:rPr>
+        <w:t>Vaishali</w:t>
+      </w:r>
+      <w:proofErr w:type="spellEnd"/>
+      <w:r>
+        <w:rPr>
+          <w:rFonts w:ascii="Segoe UI" w:hAnsi="Segoe UI"/>
+          <w:color w:val="000000"/>
+          <w:sz w:val="21"/>
+        </w:rPr>
+        <w:t xml:space="preserve"> Pujari (Project Coordinator)</w:t>
       </w:r>
     </w:p>
     <w:p>
@@ -1939,8 +2574,102 @@
           <w:sz w:val="21"/>
         </w:rPr>
       </w:pPr>
+    </w:p>
+    <w:p>
+      <w:pPr>
+        <w:rPr>
+          <w:rFonts w:ascii="Segoe UI" w:hAnsi="Segoe UI"/>
+          <w:color w:val="000000"/>
+          <w:sz w:val="21"/>
+        </w:rPr>
+      </w:pPr>
+      <w:proofErr w:type="spellStart"/>
+      <w:r>
+        <w:rPr>
+          <w:rFonts w:ascii="Segoe UI" w:hAnsi="Segoe UI"/>
+          <w:color w:val="000000"/>
+          <w:sz w:val="21"/>
+        </w:rPr>
+        <w:t>ScreenShots</w:t>
+      </w:r>
+      <w:proofErr w:type="spellEnd"/>
+      <w:r>
+        <w:rPr>
+          <w:rFonts w:ascii="Segoe UI" w:hAnsi="Segoe UI"/>
+          <w:color w:val="000000"/>
+          <w:sz w:val="21"/>
+        </w:rPr>
+        <w:t>:</w:t>
+      </w:r>
+    </w:p>
+    <w:p>
+      <w:pPr>
+        <w:pStyle w:val="NormalWeb"/>
+      </w:pPr>
       <w:bookmarkStart w:id="0" w:name="_GoBack"/>
+      <w:r>
+        <w:rPr>
+          <w:noProof/>
+        </w:rPr>
+        <w:drawing>
+          <wp:inline distT="0" distB="0" distL="0" distR="0">
+            <wp:extent cx="6260307" cy="3110590"/>
+            <wp:effectExtent l="0" t="0" r="7620" b="0"/>
+            <wp:docPr id="1" name="Picture 1" descr="D:\KGS\KGS Real estate project code\docs\phase4\screenshots\builder_dashboard_overview.png"/>
+            <wp:cNvGraphicFramePr>
+              <a:graphicFrameLocks xmlns:a="http://schemas.openxmlformats.org/drawingml/2006/main" noChangeAspect="1"/>
+            </wp:cNvGraphicFramePr>
+            <a:graphic xmlns:a="http://schemas.openxmlformats.org/drawingml/2006/main">
+              <a:graphicData uri="http://schemas.openxmlformats.org/drawingml/2006/picture">
+                <pic:pic xmlns:pic="http://schemas.openxmlformats.org/drawingml/2006/picture">
+                  <pic:nvPicPr>
+                    <pic:cNvPr id="0" name="Picture 1" descr="D:\KGS\KGS Real estate project code\docs\phase4\screenshots\builder_dashboard_overview.png"/>
+                    <pic:cNvPicPr>
+                      <a:picLocks noChangeAspect="1" noChangeArrowheads="1"/>
+                    </pic:cNvPicPr>
+                  </pic:nvPicPr>
+                  <pic:blipFill>
+                    <a:blip r:embed="rId4" cstate="print">
+                      <a:extLst>
+                        <a:ext uri="{28A0092B-C50C-407E-A947-70E740481C1C}">
+                          <a14:useLocalDpi xmlns:a14="http://schemas.microsoft.com/office/drawing/2010/main" val="0"/>
+                        </a:ext>
+                      </a:extLst>
+                    </a:blip>
+                    <a:srcRect/>
+                    <a:stretch>
+                      <a:fillRect/>
+                    </a:stretch>
+                  </pic:blipFill>
+                  <pic:spPr bwMode="auto">
+                    <a:xfrm>
+                      <a:off x="0" y="0"/>
+                      <a:ext cx="6292832" cy="3126751"/>
+                    </a:xfrm>
+                    <a:prstGeom prst="rect">
+                      <a:avLst/>
+                    </a:prstGeom>
+                    <a:noFill/>
+                    <a:ln>
+                      <a:noFill/>
+                    </a:ln>
+                  </pic:spPr>
+                </pic:pic>
+              </a:graphicData>
+            </a:graphic>
+          </wp:inline>
+        </w:drawing>
+      </w:r>
       <w:bookmarkEnd w:id="0"/>
+    </w:p>
+    <w:p>
+      <w:pPr>
+        <w:rPr>
+          <w:rFonts w:ascii="Segoe UI" w:hAnsi="Segoe UI"/>
+          <w:color w:val="000000"/>
+          <w:sz w:val="21"/>
+        </w:rPr>
+      </w:pPr>
     </w:p>
     <w:sectPr>
       <w:pgSz w:w="11906" w:h="16838"/>
@@ -2461,6 +3190,23 @@
       </w:tblBorders>
     </w:tblPr>
   </w:style>
+  <w:style w:type="paragraph" w:styleId="NormalWeb">
+    <w:name w:val="Normal (Web)"/>
+    <w:basedOn w:val="Normal"/>
+    <w:uiPriority w:val="99"/>
+    <w:semiHidden/>
+    <w:unhideWhenUsed/>
+    <w:rsid w:val="003C512E"/>
+    <w:pPr>
+      <w:spacing w:before="100" w:beforeAutospacing="1" w:after="100" w:afterAutospacing="1" w:line="240" w:lineRule="auto"/>
+    </w:pPr>
+    <w:rPr>
+      <w:rFonts w:ascii="Times New Roman" w:eastAsia="Times New Roman" w:hAnsi="Times New Roman" w:cs="Times New Roman"/>
+      <w:sz w:val="24"/>
+      <w:szCs w:val="24"/>
+      <w:lang w:eastAsia="en-IN"/>
+    </w:rPr>
+  </w:style>
 </w:styles>
 </file>
 

</xml_diff>